<commit_message>
Refactored other strings into enums
</commit_message>
<xml_diff>
--- a/frontend/summer-booking-front-office/docs/MESSAGE_FORMAT.docx
+++ b/frontend/summer-booking-front-office/docs/MESSAGE_FORMAT.docx
@@ -46,7 +46,58 @@
           <w:b w:val="0"/>
           <w:i w:val="0"/>
         </w:rPr>
-        <w:t xml:space="preserve">Aggiornato al 01/10/2026. Cartella: </w:t>
+        <w:t xml:space="preserve">Aggiornato al 08/10/2026 (tipi dei pezzi e stili come enum: </w:t>
+      </w:r>
+      <w:r>
+        <w:rPr>
+          <w:rFonts w:ascii="Consolas" w:hAnsi="Consolas"/>
+          <w:b w:val="0"/>
+          <w:i w:val="0"/>
+          <w:color w:val="233C7D"/>
+          <w:sz w:val="19"/>
+        </w:rPr>
+        <w:t>MessagePartKind</w:t>
+      </w:r>
+      <w:r>
+        <w:rPr>
+          <w:b w:val="0"/>
+          <w:i w:val="0"/>
+        </w:rPr>
+        <w:t xml:space="preserve">, </w:t>
+      </w:r>
+      <w:r>
+        <w:rPr>
+          <w:rFonts w:ascii="Consolas" w:hAnsi="Consolas"/>
+          <w:b w:val="0"/>
+          <w:i w:val="0"/>
+          <w:color w:val="233C7D"/>
+          <w:sz w:val="19"/>
+        </w:rPr>
+        <w:t>NumberStyle</w:t>
+      </w:r>
+      <w:r>
+        <w:rPr>
+          <w:b w:val="0"/>
+          <w:i w:val="0"/>
+        </w:rPr>
+        <w:t xml:space="preserve">, </w:t>
+      </w:r>
+      <w:r>
+        <w:rPr>
+          <w:rFonts w:ascii="Consolas" w:hAnsi="Consolas"/>
+          <w:b w:val="0"/>
+          <w:i w:val="0"/>
+          <w:color w:val="233C7D"/>
+          <w:sz w:val="19"/>
+        </w:rPr>
+        <w:t>DateStyle</w:t>
+      </w:r>
+      <w:r>
+        <w:rPr>
+          <w:b w:val="0"/>
+          <w:i w:val="0"/>
+        </w:rPr>
+        <w:t xml:space="preserve">). Prima, il 01/10/2026. Cartella: </w:t>
       </w:r>
       <w:r>
         <w:rPr>
@@ -5967,7 +6018,7 @@
                 <w:rFonts w:ascii="Consolas" w:hAnsi="Consolas"/>
                 <w:sz w:val="18"/>
               </w:rPr>
-              <w:t xml:space="preserve">  compileMessage, isMessage, parseMessage, MessageSyntaxError,</w:t>
+              <w:t xml:space="preserve">  compileMessage, isMessage, parseMessage, MessageSyntaxError, MessagePartKind,</w:t>
               <w:br/>
             </w:r>
             <w:r>
@@ -6699,7 +6750,7 @@
                 <w:rFonts w:ascii="Consolas" w:hAnsi="Consolas"/>
                 <w:sz w:val="18"/>
               </w:rPr>
-              <w:t>// [ 'Il ', { kind: 'date', name: 'day', style: 'long', source: '{day, date, long}' } ]</w:t>
+              <w:t>// [ 'Il ', { kind: MessagePartKind.Date, name: 'day', style: DateStyle.Long, source: '{day, date, long}' } ]</w:t>
             </w:r>
           </w:p>
         </w:tc>
@@ -7942,6 +7993,34 @@
               </w:rPr>
               <w:t>MessagePart</w:t>
             </w:r>
+            <w:r>
+              <w:rPr>
+                <w:b/>
+                <w:i w:val="0"/>
+                <w:color w:val="FFFFFF"/>
+                <w:sz w:val="20"/>
+              </w:rPr>
+              <w:t xml:space="preserve"> (</w:t>
+            </w:r>
+            <w:r>
+              <w:rPr>
+                <w:rFonts w:ascii="Consolas" w:hAnsi="Consolas"/>
+                <w:b/>
+                <w:i w:val="0"/>
+                <w:color w:val="FFFFFF"/>
+                <w:sz w:val="18"/>
+              </w:rPr>
+              <w:t>kind</w:t>
+            </w:r>
+            <w:r>
+              <w:rPr>
+                <w:b/>
+                <w:i w:val="0"/>
+                <w:color w:val="FFFFFF"/>
+                <w:sz w:val="20"/>
+              </w:rPr>
+              <w:t>)</w:t>
+            </w:r>
           </w:p>
         </w:tc>
         <w:tc>
@@ -8067,7 +8146,7 @@
                 <w:color w:val="233C7D"/>
                 <w:sz w:val="17"/>
               </w:rPr>
-              <w:t>value</w:t>
+              <w:t>MessagePartKind.Value</w:t>
             </w:r>
           </w:p>
         </w:tc>
@@ -8152,7 +8231,7 @@
                 <w:color w:val="233C7D"/>
                 <w:sz w:val="17"/>
               </w:rPr>
-              <w:t>number</w:t>
+              <w:t>MessagePartKind.Number</w:t>
             </w:r>
           </w:p>
         </w:tc>
@@ -8208,7 +8287,7 @@
                 <w:color w:val="233C7D"/>
                 <w:sz w:val="17"/>
               </w:rPr>
-              <w:t>number</w:t>
+              <w:t>NumberStyle.Number</w:t>
             </w:r>
             <w:r>
               <w:rPr>
@@ -8226,7 +8305,7 @@
                 <w:color w:val="233C7D"/>
                 <w:sz w:val="17"/>
               </w:rPr>
-              <w:t>integer</w:t>
+              <w:t>Integer</w:t>
             </w:r>
             <w:r>
               <w:rPr>
@@ -8244,7 +8323,7 @@
                 <w:color w:val="233C7D"/>
                 <w:sz w:val="17"/>
               </w:rPr>
-              <w:t>percent</w:t>
+              <w:t>Percent</w:t>
             </w:r>
             <w:r>
               <w:rPr>
@@ -8262,7 +8341,7 @@
                 <w:color w:val="233C7D"/>
                 <w:sz w:val="17"/>
               </w:rPr>
-              <w:t>currency</w:t>
+              <w:t>Currency</w:t>
             </w:r>
             <w:r>
               <w:rPr>
@@ -8326,7 +8405,7 @@
                 <w:color w:val="233C7D"/>
                 <w:sz w:val="17"/>
               </w:rPr>
-              <w:t>date</w:t>
+              <w:t>MessagePartKind.Date</w:t>
             </w:r>
             <w:r>
               <w:rPr>
@@ -8344,7 +8423,7 @@
                 <w:color w:val="233C7D"/>
                 <w:sz w:val="17"/>
               </w:rPr>
-              <w:t>time</w:t>
+              <w:t>MessagePartKind.Time</w:t>
             </w:r>
           </w:p>
         </w:tc>
@@ -8401,7 +8480,7 @@
                 <w:color w:val="233C7D"/>
                 <w:sz w:val="17"/>
               </w:rPr>
-              <w:t>short</w:t>
+              <w:t>DateStyle.Short</w:t>
             </w:r>
             <w:r>
               <w:rPr>
@@ -8419,7 +8498,7 @@
                 <w:color w:val="233C7D"/>
                 <w:sz w:val="17"/>
               </w:rPr>
-              <w:t>medium</w:t>
+              <w:t>Medium</w:t>
             </w:r>
             <w:r>
               <w:rPr>
@@ -8437,7 +8516,7 @@
                 <w:color w:val="233C7D"/>
                 <w:sz w:val="17"/>
               </w:rPr>
-              <w:t>long</w:t>
+              <w:t>Long</w:t>
             </w:r>
             <w:r>
               <w:rPr>
@@ -8455,7 +8534,25 @@
                 <w:color w:val="233C7D"/>
                 <w:sz w:val="17"/>
               </w:rPr>
-              <w:t>full</w:t>
+              <w:t>Full</w:t>
+            </w:r>
+            <w:r>
+              <w:rPr>
+                <w:b w:val="0"/>
+                <w:i w:val="0"/>
+                <w:sz w:val="19"/>
+              </w:rPr>
+              <w:t xml:space="preserve">; i valori sono quelli di </w:t>
+            </w:r>
+            <w:r>
+              <w:rPr>
+                <w:rFonts w:ascii="Consolas" w:hAnsi="Consolas"/>
+                <w:b w:val="0"/>
+                <w:i w:val="0"/>
+                <w:color w:val="233C7D"/>
+                <w:sz w:val="17"/>
+              </w:rPr>
+              <w:t>Intl.DateTimeFormat</w:t>
             </w:r>
             <w:r>
               <w:rPr>
@@ -8519,7 +8616,7 @@
                 <w:color w:val="233C7D"/>
                 <w:sz w:val="17"/>
               </w:rPr>
-              <w:t>plural</w:t>
+              <w:t>MessagePartKind.Plural</w:t>
             </w:r>
           </w:p>
         </w:tc>
@@ -8639,7 +8736,7 @@
                 <w:color w:val="233C7D"/>
                 <w:sz w:val="17"/>
               </w:rPr>
-              <w:t>count</w:t>
+              <w:t>MessagePartKind.Count</w:t>
             </w:r>
           </w:p>
         </w:tc>
@@ -8697,6 +8794,100 @@
       <w:pPr>
         <w:spacing w:after="40"/>
       </w:pPr>
+    </w:p>
+    <w:p>
+      <w:r>
+        <w:rPr>
+          <w:b w:val="0"/>
+          <w:i w:val="0"/>
+        </w:rPr>
+        <w:t>Nei testi di traduzione si scrivono le parole della sintassi ICU (</w:t>
+      </w:r>
+      <w:r>
+        <w:rPr>
+          <w:rFonts w:ascii="Consolas" w:hAnsi="Consolas"/>
+          <w:b w:val="0"/>
+          <w:i w:val="0"/>
+          <w:color w:val="233C7D"/>
+          <w:sz w:val="19"/>
+        </w:rPr>
+        <w:t>number</w:t>
+      </w:r>
+      <w:r>
+        <w:rPr>
+          <w:b w:val="0"/>
+          <w:i w:val="0"/>
+        </w:rPr>
+        <w:t xml:space="preserve">, </w:t>
+      </w:r>
+      <w:r>
+        <w:rPr>
+          <w:rFonts w:ascii="Consolas" w:hAnsi="Consolas"/>
+          <w:b w:val="0"/>
+          <w:i w:val="0"/>
+          <w:color w:val="233C7D"/>
+          <w:sz w:val="19"/>
+        </w:rPr>
+        <w:t>date</w:t>
+      </w:r>
+      <w:r>
+        <w:rPr>
+          <w:b w:val="0"/>
+          <w:i w:val="0"/>
+        </w:rPr>
+        <w:t xml:space="preserve">, </w:t>
+      </w:r>
+      <w:r>
+        <w:rPr>
+          <w:rFonts w:ascii="Consolas" w:hAnsi="Consolas"/>
+          <w:b w:val="0"/>
+          <w:i w:val="0"/>
+          <w:color w:val="233C7D"/>
+          <w:sz w:val="19"/>
+        </w:rPr>
+        <w:t>plural</w:t>
+      </w:r>
+      <w:r>
+        <w:rPr>
+          <w:b w:val="0"/>
+          <w:i w:val="0"/>
+        </w:rPr>
+        <w:t xml:space="preserve">, </w:t>
+      </w:r>
+      <w:r>
+        <w:rPr>
+          <w:rFonts w:ascii="Consolas" w:hAnsi="Consolas"/>
+          <w:b w:val="0"/>
+          <w:i w:val="0"/>
+          <w:color w:val="233C7D"/>
+          <w:sz w:val="19"/>
+        </w:rPr>
+        <w:t>percent</w:t>
+      </w:r>
+      <w:r>
+        <w:rPr>
+          <w:b w:val="0"/>
+          <w:i w:val="0"/>
+        </w:rPr>
+        <w:t xml:space="preserve">, </w:t>
+      </w:r>
+      <w:r>
+        <w:rPr>
+          <w:rFonts w:ascii="Consolas" w:hAnsi="Consolas"/>
+          <w:b w:val="0"/>
+          <w:i w:val="0"/>
+          <w:color w:val="233C7D"/>
+          <w:sz w:val="19"/>
+        </w:rPr>
+        <w:t>long</w:t>
+      </w:r>
+      <w:r>
+        <w:rPr>
+          <w:b w:val="0"/>
+          <w:i w:val="0"/>
+        </w:rPr>
+        <w:t>…): il parser le converte negli enum con una tabella, l'unico punto dove compaiono come stringhe.</w:t>
+      </w:r>
     </w:p>
     <w:p>
       <w:r>

</xml_diff>